<commit_message>
feat(signature): optional signer_position in КЕП mark (hybrid)
- ElectronicSignatureMark.signer_position (optional): posada is a NON-
  mandatory certificate field (Law 2155-VIII Art.23), present only in
  employee certificates. Printed in the mark only when set; otherwise omitted.
- render Посада line in pdf/docx e-signature mark frame when present
- legal-process sample: director + chief accountant now carry posada,
  disambiguating the two signers in the mark
</commit_message>
<xml_diff>
--- a/samples/docx/nakaz_process.docx
+++ b/samples/docx/nakaz_process.docx
@@ -297,6 +297,18 @@
                 <w:b w:val="0"/>
                 <w:sz w:val="16"/>
               </w:rPr>
+              <w:t>Посада: Директор</w:t>
+            </w:r>
+          </w:p>
+          <w:p>
+            <w:pPr>
+              <w:spacing w:line="240" w:lineRule="auto" w:after="0"/>
+            </w:pPr>
+            <w:r>
+              <w:rPr>
+                <w:b w:val="0"/>
+                <w:sz w:val="16"/>
+              </w:rPr>
               <w:t>Сертифікат: 58E2D9C1F0A4B7E3</w:t>
             </w:r>
           </w:p>
@@ -440,6 +452,18 @@
                 <w:sz w:val="16"/>
               </w:rPr>
               <w:t>Підписувач: ТКАЧЕНКО Наталія Сергіївна</w:t>
+            </w:r>
+          </w:p>
+          <w:p>
+            <w:pPr>
+              <w:spacing w:line="240" w:lineRule="auto" w:after="0"/>
+            </w:pPr>
+            <w:r>
+              <w:rPr>
+                <w:b w:val="0"/>
+                <w:sz w:val="16"/>
+              </w:rPr>
+              <w:t>Посада: Головний бухгалтер</w:t>
             </w:r>
           </w:p>
           <w:p>

</xml_diff>